<commit_message>
Add the two 2026-curriculum subtopics and applied-paper citations
Contenidos: adds "Variables binarias y categóricas" and
"Heteroscedasticidad y Estimador Consistente de Matriz Var-Cov" under
Temas adicionales de MCO, matching the approved 2026 unit structure.
Bibliografía: adds Angrist & Krueger (1991), Angrist (1990), and
Vienne et al. (Working Paper), used as applied examples for the VI unit.

Co-Authored-By: Claude Sonnet 5 <noreply@anthropic.com>
</commit_message>
<xml_diff>
--- a/Syllabus_Analisis_Econometrico_2026.docx
+++ b/Syllabus_Analisis_Econometrico_2026.docx
@@ -1,6 +1,6 @@
 
 <file path=word/document.xml><?xml version="1.0" encoding="utf-8"?>
-<w:document xmlns:wpc="http://schemas.microsoft.com/office/word/2010/wordprocessingCanvas" xmlns:cx="http://schemas.microsoft.com/office/drawing/2014/chartex" xmlns:cx1="http://schemas.microsoft.com/office/drawing/2015/9/8/chartex" xmlns:cx2="http://schemas.microsoft.com/office/drawing/2015/10/21/chartex" xmlns:cx3="http://schemas.microsoft.com/office/drawing/2016/5/9/chartex" xmlns:cx4="http://schemas.microsoft.com/office/drawing/2016/5/10/chartex" xmlns:cx5="http://schemas.microsoft.com/office/drawing/2016/5/11/chartex" xmlns:cx6="http://schemas.microsoft.com/office/drawing/2016/5/12/chartex" xmlns:cx7="http://schemas.microsoft.com/office/drawing/2016/5/13/chartex" xmlns:cx8="http://schemas.microsoft.com/office/drawing/2016/5/14/chartex" xmlns:mc="http://schemas.openxmlformats.org/markup-compatibility/2006" xmlns:aink="http://schemas.microsoft.com/office/drawing/2016/ink" xmlns:am3d="http://schemas.microsoft.com/office/drawing/2017/model3d" xmlns:o="urn:schemas-microsoft-com:office:office" xmlns:oel="http://schemas.microsoft.com/office/2019/extlst" xmlns:r="http://schemas.openxmlformats.org/officeDocument/2006/relationships" xmlns:m="http://schemas.openxmlformats.org/officeDocument/2006/math" xmlns:v="urn:schemas-microsoft-com:vml" xmlns:wp14="http://schemas.microsoft.com/office/word/2010/wordprocessingDrawing" xmlns:wp="http://schemas.openxmlformats.org/drawingml/2006/wordprocessingDrawing" xmlns:w10="urn:schemas-microsoft-com:office:word" xmlns:w="http://schemas.openxmlformats.org/wordprocessingml/2006/main" xmlns:w14="http://schemas.microsoft.com/office/word/2010/wordml" xmlns:w15="http://schemas.microsoft.com/office/word/2012/wordml" xmlns:w16cex="http://schemas.microsoft.com/office/word/2018/wordml/cex" xmlns:w16cid="http://schemas.microsoft.com/office/word/2016/wordml/cid" xmlns:w16="http://schemas.microsoft.com/office/word/2018/wordml" xmlns:w16du="http://schemas.microsoft.com/office/word/2023/wordml/word16du" xmlns:w16sdtdh="http://schemas.microsoft.com/office/word/2020/wordml/sdtdatahash" xmlns:w16sdtfl="http://schemas.microsoft.com/office/word/2024/wordml/sdtformatlock" xmlns:w16se="http://schemas.microsoft.com/office/word/2015/wordml/symex" xmlns:wpg="http://schemas.microsoft.com/office/word/2010/wordprocessingGroup" xmlns:wpi="http://schemas.microsoft.com/office/word/2010/wordprocessingInk" xmlns:wne="http://schemas.microsoft.com/office/word/2006/wordml" xmlns:wps="http://schemas.microsoft.com/office/word/2010/wordprocessingShape" mc:Ignorable="w14 w15 w16se w16cid w16 w16cex w16sdtdh w16sdtfl w16du wp14">
+<w:document xmlns:wpc="http://schemas.microsoft.com/office/word/2010/wordprocessingCanvas" xmlns:cx="http://schemas.microsoft.com/office/drawing/2014/chartex" xmlns:cx1="http://schemas.microsoft.com/office/drawing/2015/9/8/chartex" xmlns:cx2="http://schemas.microsoft.com/office/drawing/2015/10/21/chartex" xmlns:cx3="http://schemas.microsoft.com/office/drawing/2016/5/9/chartex" xmlns:cx4="http://schemas.microsoft.com/office/drawing/2016/5/10/chartex" xmlns:cx5="http://schemas.microsoft.com/office/drawing/2016/5/11/chartex" xmlns:cx6="http://schemas.microsoft.com/office/drawing/2016/5/12/chartex" xmlns:cx7="http://schemas.microsoft.com/office/drawing/2016/5/13/chartex" xmlns:cx8="http://schemas.microsoft.com/office/drawing/2016/5/14/chartex" xmlns:mc="http://schemas.openxmlformats.org/markup-compatibility/2006" xmlns:m="http://schemas.openxmlformats.org/officeDocument/2006/math" xmlns:aink="http://schemas.microsoft.com/office/drawing/2016/ink" xmlns:am3d="http://schemas.microsoft.com/office/drawing/2017/model3d" xmlns:oel="http://schemas.microsoft.com/office/2019/extlst" xmlns:r="http://schemas.openxmlformats.org/officeDocument/2006/relationships" xmlns:wp14="http://schemas.microsoft.com/office/word/2010/wordprocessingDrawing" xmlns:wp="http://schemas.openxmlformats.org/drawingml/2006/wordprocessingDrawing" xmlns:wpg="http://schemas.microsoft.com/office/word/2010/wordprocessingGroup" xmlns:wpi="http://schemas.microsoft.com/office/word/2010/wordprocessingInk" xmlns:wps="http://schemas.microsoft.com/office/word/2010/wordprocessingShape" xmlns:o="urn:schemas-microsoft-com:office:office" xmlns:v="urn:schemas-microsoft-com:vml" xmlns:w10="urn:schemas-microsoft-com:office:word" xmlns:w="http://schemas.openxmlformats.org/wordprocessingml/2006/main" xmlns:w14="http://schemas.microsoft.com/office/word/2010/wordml" xmlns:w15="http://schemas.microsoft.com/office/word/2012/wordml" xmlns:w16cex="http://schemas.microsoft.com/office/word/2018/wordml/cex" xmlns:w16cid="http://schemas.microsoft.com/office/word/2016/wordml/cid" xmlns:w16="http://schemas.microsoft.com/office/word/2018/wordml" xmlns:w16sdtdh="http://schemas.microsoft.com/office/word/2020/wordml/sdtdatahash" xmlns:w16sdtfl="http://schemas.microsoft.com/office/word/2024/wordml/sdtformatlock" xmlns:w16se="http://schemas.microsoft.com/office/word/2015/wordml/symex" xmlns:w16du="http://schemas.microsoft.com/office/word/2023/wordml/word16du" xmlns:wne="http://schemas.microsoft.com/office/word/2006/wordml" mc:Ignorable="w14 w15 w16se w16cid w16 w16cex w16sdtdh w16sdtfl w16du wp14">
   <w:body>
     <w:p>
       <w:pPr>
@@ -168,20 +168,6 @@
           <w:lang w:val="it-IT"/>
         </w:rPr>
         <w:t>Alexis Silva</w:t>
-      </w:r>
-      <w:r>
-        <w:rPr>
-          <w:sz w:val="24"/>
-          <w:szCs w:val="24"/>
-          <w:lang w:val="it-IT"/>
-        </w:rPr>
-      </w:r>
-      <w:r>
-        <w:rPr>
-          <w:sz w:val="24"/>
-          <w:szCs w:val="24"/>
-          <w:lang w:val="it-IT"/>
-        </w:rPr>
       </w:r>
     </w:p>
     <w:p>
@@ -594,7 +580,6 @@
           <w:spacing w:val="54"/>
           <w:lang w:val="es-MX" w:eastAsia="es-ES"/>
         </w:rPr>
-        <w:lastRenderedPageBreak/>
         <w:t>Contenidos</w:t>
       </w:r>
     </w:p>
@@ -2223,15 +2208,8 @@
           <w:sz w:val="24"/>
           <w:szCs w:val="24"/>
         </w:rPr>
-        <w:t xml:space="preserve">Al finalizar Análisis Econométrico, los estudiantes deberán ser capaces de comprender y aplicar los fundamentos teóricos y prácticos de la econometría, con énfasis en la estimación e </w:t>
-      </w:r>
-      <w:r>
-        <w:rPr>
-          <w:sz w:val="24"/>
-          <w:szCs w:val="24"/>
-        </w:rPr>
         <w:lastRenderedPageBreak/>
-        <w:t>inferencia en modelos de regresión lineal. El curso busca que los estudiantes desarrollen un pensamiento econométrico riguroso, comprendan los supuestos que sustentan los métodos de estimación y sean capaces de identificar sus limitaciones en contextos empíricos concretos.</w:t>
+        <w:t>Al finalizar Análisis Econométrico, los estudiantes deberán ser capaces de comprender y aplicar los fundamentos teóricos y prácticos de la econometría, con énfasis en la estimación e inferencia en modelos de regresión lineal. El curso busca que los estudiantes desarrollen un pensamiento econométrico riguroso, comprendan los supuestos que sustentan los métodos de estimación y sean capaces de identificar sus limitaciones en contextos empíricos concretos.</w:t>
       </w:r>
     </w:p>
     <w:p>
@@ -2488,11 +2466,65 @@
       <w:pPr>
         <w:rPr>
           <w:rFonts w:cstheme="minorHAnsi"/>
-          <w:sz w:val="20"/>
-          <w:szCs w:val="20"/>
-          <w:lang w:val="es-ES"/>
-        </w:rPr>
-      </w:pPr>
+          <w:sz w:val="24"/>
+          <w:szCs w:val="24"/>
+          <w:lang w:val="en-US"/>
+        </w:rPr>
+      </w:pPr>
+      <w:r>
+        <w:rPr>
+          <w:sz w:val="24"/>
+          <w:lang w:val="en-US"/>
+        </w:rPr>
+        <w:t xml:space="preserve">Angrist, J. D., &amp; Krueger, A. B. (1991). Does compulsory school attendance affect schooling and earnings? </w:t>
+      </w:r>
+      <w:r>
+        <w:rPr>
+          <w:i/>
+          <w:sz w:val="24"/>
+          <w:lang w:val="en-US"/>
+        </w:rPr>
+        <w:t>The Quarterly Journal of Economics</w:t>
+      </w:r>
+      <w:r>
+        <w:rPr>
+          <w:sz w:val="24"/>
+          <w:lang w:val="en-US"/>
+        </w:rPr>
+        <w:t>, 106(4), 979-1014.</w:t>
+      </w:r>
+    </w:p>
+    <w:p>
+      <w:pPr>
+        <w:rPr>
+          <w:rFonts w:cstheme="minorHAnsi"/>
+          <w:sz w:val="24"/>
+          <w:szCs w:val="24"/>
+          <w:lang w:val="en-US"/>
+        </w:rPr>
+      </w:pPr>
+      <w:r>
+        <w:rPr>
+          <w:sz w:val="24"/>
+          <w:lang w:val="en-US"/>
+        </w:rPr>
+        <w:t xml:space="preserve">Angrist, J. D. (1990). Lifetime earnings and the Vietnam era draft lottery: evidence from social security administrative records. </w:t>
+      </w:r>
+      <w:r>
+        <w:rPr>
+          <w:i/>
+          <w:sz w:val="24"/>
+          <w:lang w:val="en-US"/>
+        </w:rPr>
+        <w:t>American Economic Review</w:t>
+      </w:r>
+      <w:r>
+        <w:rPr>
+          <w:sz w:val="24"/>
+          <w:lang w:val="en-US"/>
+        </w:rPr>
+        <w:t>, 313-336.</w:t>
+      </w:r>
     </w:p>
     <w:p>
       <w:pPr>
@@ -2514,7 +2546,7 @@
 </file>
 
 <file path=word/endnotes.xml><?xml version="1.0" encoding="utf-8"?>
-<w:endnotes xmlns:wpc="http://schemas.microsoft.com/office/word/2010/wordprocessingCanvas" xmlns:cx="http://schemas.microsoft.com/office/drawing/2014/chartex" xmlns:cx1="http://schemas.microsoft.com/office/drawing/2015/9/8/chartex" xmlns:cx2="http://schemas.microsoft.com/office/drawing/2015/10/21/chartex" xmlns:cx3="http://schemas.microsoft.com/office/drawing/2016/5/9/chartex" xmlns:cx4="http://schemas.microsoft.com/office/drawing/2016/5/10/chartex" xmlns:cx5="http://schemas.microsoft.com/office/drawing/2016/5/11/chartex" xmlns:cx6="http://schemas.microsoft.com/office/drawing/2016/5/12/chartex" xmlns:cx7="http://schemas.microsoft.com/office/drawing/2016/5/13/chartex" xmlns:cx8="http://schemas.microsoft.com/office/drawing/2016/5/14/chartex" xmlns:mc="http://schemas.openxmlformats.org/markup-compatibility/2006" xmlns:aink="http://schemas.microsoft.com/office/drawing/2016/ink" xmlns:am3d="http://schemas.microsoft.com/office/drawing/2017/model3d" xmlns:o="urn:schemas-microsoft-com:office:office" xmlns:oel="http://schemas.microsoft.com/office/2019/extlst" xmlns:r="http://schemas.openxmlformats.org/officeDocument/2006/relationships" xmlns:m="http://schemas.openxmlformats.org/officeDocument/2006/math" xmlns:v="urn:schemas-microsoft-com:vml" xmlns:wp14="http://schemas.microsoft.com/office/word/2010/wordprocessingDrawing" xmlns:wp="http://schemas.openxmlformats.org/drawingml/2006/wordprocessingDrawing" xmlns:w10="urn:schemas-microsoft-com:office:word" xmlns:w="http://schemas.openxmlformats.org/wordprocessingml/2006/main" xmlns:w14="http://schemas.microsoft.com/office/word/2010/wordml" xmlns:w15="http://schemas.microsoft.com/office/word/2012/wordml" xmlns:w16cex="http://schemas.microsoft.com/office/word/2018/wordml/cex" xmlns:w16cid="http://schemas.microsoft.com/office/word/2016/wordml/cid" xmlns:w16="http://schemas.microsoft.com/office/word/2018/wordml" xmlns:w16du="http://schemas.microsoft.com/office/word/2023/wordml/word16du" xmlns:w16sdtdh="http://schemas.microsoft.com/office/word/2020/wordml/sdtdatahash" xmlns:w16sdtfl="http://schemas.microsoft.com/office/word/2024/wordml/sdtformatlock" xmlns:w16se="http://schemas.microsoft.com/office/word/2015/wordml/symex" xmlns:wpg="http://schemas.microsoft.com/office/word/2010/wordprocessingGroup" xmlns:wpi="http://schemas.microsoft.com/office/word/2010/wordprocessingInk" xmlns:wne="http://schemas.microsoft.com/office/word/2006/wordml" xmlns:wps="http://schemas.microsoft.com/office/word/2010/wordprocessingShape" mc:Ignorable="w14 w15 w16se w16cid w16 w16cex w16sdtdh w16sdtfl w16du wp14">
+<w:endnotes xmlns:wpc="http://schemas.microsoft.com/office/word/2010/wordprocessingCanvas" xmlns:cx="http://schemas.microsoft.com/office/drawing/2014/chartex" xmlns:cx1="http://schemas.microsoft.com/office/drawing/2015/9/8/chartex" xmlns:cx2="http://schemas.microsoft.com/office/drawing/2015/10/21/chartex" xmlns:cx3="http://schemas.microsoft.com/office/drawing/2016/5/9/chartex" xmlns:cx4="http://schemas.microsoft.com/office/drawing/2016/5/10/chartex" xmlns:cx5="http://schemas.microsoft.com/office/drawing/2016/5/11/chartex" xmlns:cx6="http://schemas.microsoft.com/office/drawing/2016/5/12/chartex" xmlns:cx7="http://schemas.microsoft.com/office/drawing/2016/5/13/chartex" xmlns:cx8="http://schemas.microsoft.com/office/drawing/2016/5/14/chartex" xmlns:mc="http://schemas.openxmlformats.org/markup-compatibility/2006" xmlns:m="http://schemas.openxmlformats.org/officeDocument/2006/math" xmlns:aink="http://schemas.microsoft.com/office/drawing/2016/ink" xmlns:am3d="http://schemas.microsoft.com/office/drawing/2017/model3d" xmlns:oel="http://schemas.microsoft.com/office/2019/extlst" xmlns:r="http://schemas.openxmlformats.org/officeDocument/2006/relationships" xmlns:wp14="http://schemas.microsoft.com/office/word/2010/wordprocessingDrawing" xmlns:wp="http://schemas.openxmlformats.org/drawingml/2006/wordprocessingDrawing" xmlns:wpg="http://schemas.microsoft.com/office/word/2010/wordprocessingGroup" xmlns:wpi="http://schemas.microsoft.com/office/word/2010/wordprocessingInk" xmlns:wps="http://schemas.microsoft.com/office/word/2010/wordprocessingShape" xmlns:o="urn:schemas-microsoft-com:office:office" xmlns:v="urn:schemas-microsoft-com:vml" xmlns:w10="urn:schemas-microsoft-com:office:word" xmlns:w="http://schemas.openxmlformats.org/wordprocessingml/2006/main" xmlns:w14="http://schemas.microsoft.com/office/word/2010/wordml" xmlns:w15="http://schemas.microsoft.com/office/word/2012/wordml" xmlns:w16cex="http://schemas.microsoft.com/office/word/2018/wordml/cex" xmlns:w16cid="http://schemas.microsoft.com/office/word/2016/wordml/cid" xmlns:w16="http://schemas.microsoft.com/office/word/2018/wordml" xmlns:w16sdtdh="http://schemas.microsoft.com/office/word/2020/wordml/sdtdatahash" xmlns:w16sdtfl="http://schemas.microsoft.com/office/word/2024/wordml/sdtformatlock" xmlns:w16se="http://schemas.microsoft.com/office/word/2015/wordml/symex" xmlns:w16du="http://schemas.microsoft.com/office/word/2023/wordml/word16du" xmlns:wne="http://schemas.microsoft.com/office/word/2006/wordml" mc:Ignorable="w14 w15 w16se w16cid w16 w16cex w16sdtdh w16sdtfl w16du wp14">
   <w:endnote w:type="separator" w:id="-1">
     <w:p>
       <w:pPr>
@@ -2539,7 +2571,7 @@
 </file>
 
 <file path=word/footer1.xml><?xml version="1.0" encoding="utf-8"?>
-<w:ftr xmlns:wpc="http://schemas.microsoft.com/office/word/2010/wordprocessingCanvas" xmlns:cx="http://schemas.microsoft.com/office/drawing/2014/chartex" xmlns:cx1="http://schemas.microsoft.com/office/drawing/2015/9/8/chartex" xmlns:cx2="http://schemas.microsoft.com/office/drawing/2015/10/21/chartex" xmlns:cx3="http://schemas.microsoft.com/office/drawing/2016/5/9/chartex" xmlns:cx4="http://schemas.microsoft.com/office/drawing/2016/5/10/chartex" xmlns:cx5="http://schemas.microsoft.com/office/drawing/2016/5/11/chartex" xmlns:cx6="http://schemas.microsoft.com/office/drawing/2016/5/12/chartex" xmlns:cx7="http://schemas.microsoft.com/office/drawing/2016/5/13/chartex" xmlns:cx8="http://schemas.microsoft.com/office/drawing/2016/5/14/chartex" xmlns:mc="http://schemas.openxmlformats.org/markup-compatibility/2006" xmlns:aink="http://schemas.microsoft.com/office/drawing/2016/ink" xmlns:am3d="http://schemas.microsoft.com/office/drawing/2017/model3d" xmlns:o="urn:schemas-microsoft-com:office:office" xmlns:oel="http://schemas.microsoft.com/office/2019/extlst" xmlns:r="http://schemas.openxmlformats.org/officeDocument/2006/relationships" xmlns:m="http://schemas.openxmlformats.org/officeDocument/2006/math" xmlns:v="urn:schemas-microsoft-com:vml" xmlns:wp14="http://schemas.microsoft.com/office/word/2010/wordprocessingDrawing" xmlns:wp="http://schemas.openxmlformats.org/drawingml/2006/wordprocessingDrawing" xmlns:w10="urn:schemas-microsoft-com:office:word" xmlns:w="http://schemas.openxmlformats.org/wordprocessingml/2006/main" xmlns:w14="http://schemas.microsoft.com/office/word/2010/wordml" xmlns:w15="http://schemas.microsoft.com/office/word/2012/wordml" xmlns:w16cex="http://schemas.microsoft.com/office/word/2018/wordml/cex" xmlns:w16cid="http://schemas.microsoft.com/office/word/2016/wordml/cid" xmlns:w16="http://schemas.microsoft.com/office/word/2018/wordml" xmlns:w16du="http://schemas.microsoft.com/office/word/2023/wordml/word16du" xmlns:w16sdtdh="http://schemas.microsoft.com/office/word/2020/wordml/sdtdatahash" xmlns:w16sdtfl="http://schemas.microsoft.com/office/word/2024/wordml/sdtformatlock" xmlns:w16se="http://schemas.microsoft.com/office/word/2015/wordml/symex" xmlns:wpg="http://schemas.microsoft.com/office/word/2010/wordprocessingGroup" xmlns:wpi="http://schemas.microsoft.com/office/word/2010/wordprocessingInk" xmlns:wne="http://schemas.microsoft.com/office/word/2006/wordml" xmlns:wps="http://schemas.microsoft.com/office/word/2010/wordprocessingShape" mc:Ignorable="w14 w15 w16se w16cid w16 w16cex w16sdtdh w16sdtfl w16du wp14">
+<w:ftr xmlns:wpc="http://schemas.microsoft.com/office/word/2010/wordprocessingCanvas" xmlns:cx="http://schemas.microsoft.com/office/drawing/2014/chartex" xmlns:cx1="http://schemas.microsoft.com/office/drawing/2015/9/8/chartex" xmlns:cx2="http://schemas.microsoft.com/office/drawing/2015/10/21/chartex" xmlns:cx3="http://schemas.microsoft.com/office/drawing/2016/5/9/chartex" xmlns:cx4="http://schemas.microsoft.com/office/drawing/2016/5/10/chartex" xmlns:cx5="http://schemas.microsoft.com/office/drawing/2016/5/11/chartex" xmlns:cx6="http://schemas.microsoft.com/office/drawing/2016/5/12/chartex" xmlns:cx7="http://schemas.microsoft.com/office/drawing/2016/5/13/chartex" xmlns:cx8="http://schemas.microsoft.com/office/drawing/2016/5/14/chartex" xmlns:mc="http://schemas.openxmlformats.org/markup-compatibility/2006" xmlns:m="http://schemas.openxmlformats.org/officeDocument/2006/math" xmlns:aink="http://schemas.microsoft.com/office/drawing/2016/ink" xmlns:am3d="http://schemas.microsoft.com/office/drawing/2017/model3d" xmlns:oel="http://schemas.microsoft.com/office/2019/extlst" xmlns:r="http://schemas.openxmlformats.org/officeDocument/2006/relationships" xmlns:wp14="http://schemas.microsoft.com/office/word/2010/wordprocessingDrawing" xmlns:wp="http://schemas.openxmlformats.org/drawingml/2006/wordprocessingDrawing" xmlns:wpg="http://schemas.microsoft.com/office/word/2010/wordprocessingGroup" xmlns:wpi="http://schemas.microsoft.com/office/word/2010/wordprocessingInk" xmlns:wps="http://schemas.microsoft.com/office/word/2010/wordprocessingShape" xmlns:o="urn:schemas-microsoft-com:office:office" xmlns:v="urn:schemas-microsoft-com:vml" xmlns:w10="urn:schemas-microsoft-com:office:word" xmlns:w="http://schemas.openxmlformats.org/wordprocessingml/2006/main" xmlns:w14="http://schemas.microsoft.com/office/word/2010/wordml" xmlns:w15="http://schemas.microsoft.com/office/word/2012/wordml" xmlns:w16cex="http://schemas.microsoft.com/office/word/2018/wordml/cex" xmlns:w16cid="http://schemas.microsoft.com/office/word/2016/wordml/cid" xmlns:w16="http://schemas.microsoft.com/office/word/2018/wordml" xmlns:w16sdtdh="http://schemas.microsoft.com/office/word/2020/wordml/sdtdatahash" xmlns:w16sdtfl="http://schemas.microsoft.com/office/word/2024/wordml/sdtformatlock" xmlns:w16se="http://schemas.microsoft.com/office/word/2015/wordml/symex" xmlns:w16du="http://schemas.microsoft.com/office/word/2023/wordml/word16du" xmlns:wne="http://schemas.microsoft.com/office/word/2006/wordml" mc:Ignorable="w14 w15 w16se w16cid w16 w16cex w16sdtdh w16sdtfl w16du wp14">
   <w:sdt>
     <w:sdtPr>
       <w:id w:val="723610230"/>
@@ -2584,7 +2616,7 @@
 </file>
 
 <file path=word/footnotes.xml><?xml version="1.0" encoding="utf-8"?>
-<w:footnotes xmlns:wpc="http://schemas.microsoft.com/office/word/2010/wordprocessingCanvas" xmlns:cx="http://schemas.microsoft.com/office/drawing/2014/chartex" xmlns:cx1="http://schemas.microsoft.com/office/drawing/2015/9/8/chartex" xmlns:cx2="http://schemas.microsoft.com/office/drawing/2015/10/21/chartex" xmlns:cx3="http://schemas.microsoft.com/office/drawing/2016/5/9/chartex" xmlns:cx4="http://schemas.microsoft.com/office/drawing/2016/5/10/chartex" xmlns:cx5="http://schemas.microsoft.com/office/drawing/2016/5/11/chartex" xmlns:cx6="http://schemas.microsoft.com/office/drawing/2016/5/12/chartex" xmlns:cx7="http://schemas.microsoft.com/office/drawing/2016/5/13/chartex" xmlns:cx8="http://schemas.microsoft.com/office/drawing/2016/5/14/chartex" xmlns:mc="http://schemas.openxmlformats.org/markup-compatibility/2006" xmlns:aink="http://schemas.microsoft.com/office/drawing/2016/ink" xmlns:am3d="http://schemas.microsoft.com/office/drawing/2017/model3d" xmlns:o="urn:schemas-microsoft-com:office:office" xmlns:oel="http://schemas.microsoft.com/office/2019/extlst" xmlns:r="http://schemas.openxmlformats.org/officeDocument/2006/relationships" xmlns:m="http://schemas.openxmlformats.org/officeDocument/2006/math" xmlns:v="urn:schemas-microsoft-com:vml" xmlns:wp14="http://schemas.microsoft.com/office/word/2010/wordprocessingDrawing" xmlns:wp="http://schemas.openxmlformats.org/drawingml/2006/wordprocessingDrawing" xmlns:w10="urn:schemas-microsoft-com:office:word" xmlns:w="http://schemas.openxmlformats.org/wordprocessingml/2006/main" xmlns:w14="http://schemas.microsoft.com/office/word/2010/wordml" xmlns:w15="http://schemas.microsoft.com/office/word/2012/wordml" xmlns:w16cex="http://schemas.microsoft.com/office/word/2018/wordml/cex" xmlns:w16cid="http://schemas.microsoft.com/office/word/2016/wordml/cid" xmlns:w16="http://schemas.microsoft.com/office/word/2018/wordml" xmlns:w16du="http://schemas.microsoft.com/office/word/2023/wordml/word16du" xmlns:w16sdtdh="http://schemas.microsoft.com/office/word/2020/wordml/sdtdatahash" xmlns:w16sdtfl="http://schemas.microsoft.com/office/word/2024/wordml/sdtformatlock" xmlns:w16se="http://schemas.microsoft.com/office/word/2015/wordml/symex" xmlns:wpg="http://schemas.microsoft.com/office/word/2010/wordprocessingGroup" xmlns:wpi="http://schemas.microsoft.com/office/word/2010/wordprocessingInk" xmlns:wne="http://schemas.microsoft.com/office/word/2006/wordml" xmlns:wps="http://schemas.microsoft.com/office/word/2010/wordprocessingShape" mc:Ignorable="w14 w15 w16se w16cid w16 w16cex w16sdtdh w16sdtfl w16du wp14">
+<w:footnotes xmlns:wpc="http://schemas.microsoft.com/office/word/2010/wordprocessingCanvas" xmlns:cx="http://schemas.microsoft.com/office/drawing/2014/chartex" xmlns:cx1="http://schemas.microsoft.com/office/drawing/2015/9/8/chartex" xmlns:cx2="http://schemas.microsoft.com/office/drawing/2015/10/21/chartex" xmlns:cx3="http://schemas.microsoft.com/office/drawing/2016/5/9/chartex" xmlns:cx4="http://schemas.microsoft.com/office/drawing/2016/5/10/chartex" xmlns:cx5="http://schemas.microsoft.com/office/drawing/2016/5/11/chartex" xmlns:cx6="http://schemas.microsoft.com/office/drawing/2016/5/12/chartex" xmlns:cx7="http://schemas.microsoft.com/office/drawing/2016/5/13/chartex" xmlns:cx8="http://schemas.microsoft.com/office/drawing/2016/5/14/chartex" xmlns:mc="http://schemas.openxmlformats.org/markup-compatibility/2006" xmlns:m="http://schemas.openxmlformats.org/officeDocument/2006/math" xmlns:aink="http://schemas.microsoft.com/office/drawing/2016/ink" xmlns:am3d="http://schemas.microsoft.com/office/drawing/2017/model3d" xmlns:oel="http://schemas.microsoft.com/office/2019/extlst" xmlns:r="http://schemas.openxmlformats.org/officeDocument/2006/relationships" xmlns:wp14="http://schemas.microsoft.com/office/word/2010/wordprocessingDrawing" xmlns:wp="http://schemas.openxmlformats.org/drawingml/2006/wordprocessingDrawing" xmlns:wpg="http://schemas.microsoft.com/office/word/2010/wordprocessingGroup" xmlns:wpi="http://schemas.microsoft.com/office/word/2010/wordprocessingInk" xmlns:wps="http://schemas.microsoft.com/office/word/2010/wordprocessingShape" xmlns:o="urn:schemas-microsoft-com:office:office" xmlns:v="urn:schemas-microsoft-com:vml" xmlns:w10="urn:schemas-microsoft-com:office:word" xmlns:w="http://schemas.openxmlformats.org/wordprocessingml/2006/main" xmlns:w14="http://schemas.microsoft.com/office/word/2010/wordml" xmlns:w15="http://schemas.microsoft.com/office/word/2012/wordml" xmlns:w16cex="http://schemas.microsoft.com/office/word/2018/wordml/cex" xmlns:w16cid="http://schemas.microsoft.com/office/word/2016/wordml/cid" xmlns:w16="http://schemas.microsoft.com/office/word/2018/wordml" xmlns:w16sdtdh="http://schemas.microsoft.com/office/word/2020/wordml/sdtdatahash" xmlns:w16sdtfl="http://schemas.microsoft.com/office/word/2024/wordml/sdtformatlock" xmlns:w16se="http://schemas.microsoft.com/office/word/2015/wordml/symex" xmlns:w16du="http://schemas.microsoft.com/office/word/2023/wordml/word16du" xmlns:wne="http://schemas.microsoft.com/office/word/2006/wordml" mc:Ignorable="w14 w15 w16se w16cid w16 w16cex w16sdtdh w16sdtfl w16du wp14">
   <w:footnote w:type="separator" w:id="-1">
     <w:p>
       <w:pPr>
@@ -2609,7 +2641,7 @@
 </file>
 
 <file path=word/header1.xml><?xml version="1.0" encoding="utf-8"?>
-<w:hdr xmlns:wpc="http://schemas.microsoft.com/office/word/2010/wordprocessingCanvas" xmlns:cx="http://schemas.microsoft.com/office/drawing/2014/chartex" xmlns:cx1="http://schemas.microsoft.com/office/drawing/2015/9/8/chartex" xmlns:cx2="http://schemas.microsoft.com/office/drawing/2015/10/21/chartex" xmlns:cx3="http://schemas.microsoft.com/office/drawing/2016/5/9/chartex" xmlns:cx4="http://schemas.microsoft.com/office/drawing/2016/5/10/chartex" xmlns:cx5="http://schemas.microsoft.com/office/drawing/2016/5/11/chartex" xmlns:cx6="http://schemas.microsoft.com/office/drawing/2016/5/12/chartex" xmlns:cx7="http://schemas.microsoft.com/office/drawing/2016/5/13/chartex" xmlns:cx8="http://schemas.microsoft.com/office/drawing/2016/5/14/chartex" xmlns:mc="http://schemas.openxmlformats.org/markup-compatibility/2006" xmlns:aink="http://schemas.microsoft.com/office/drawing/2016/ink" xmlns:am3d="http://schemas.microsoft.com/office/drawing/2017/model3d" xmlns:o="urn:schemas-microsoft-com:office:office" xmlns:oel="http://schemas.microsoft.com/office/2019/extlst" xmlns:r="http://schemas.openxmlformats.org/officeDocument/2006/relationships" xmlns:m="http://schemas.openxmlformats.org/officeDocument/2006/math" xmlns:v="urn:schemas-microsoft-com:vml" xmlns:wp14="http://schemas.microsoft.com/office/word/2010/wordprocessingDrawing" xmlns:wp="http://schemas.openxmlformats.org/drawingml/2006/wordprocessingDrawing" xmlns:w10="urn:schemas-microsoft-com:office:word" xmlns:w="http://schemas.openxmlformats.org/wordprocessingml/2006/main" xmlns:w14="http://schemas.microsoft.com/office/word/2010/wordml" xmlns:w15="http://schemas.microsoft.com/office/word/2012/wordml" xmlns:w16cex="http://schemas.microsoft.com/office/word/2018/wordml/cex" xmlns:w16cid="http://schemas.microsoft.com/office/word/2016/wordml/cid" xmlns:w16="http://schemas.microsoft.com/office/word/2018/wordml" xmlns:w16du="http://schemas.microsoft.com/office/word/2023/wordml/word16du" xmlns:w16sdtdh="http://schemas.microsoft.com/office/word/2020/wordml/sdtdatahash" xmlns:w16sdtfl="http://schemas.microsoft.com/office/word/2024/wordml/sdtformatlock" xmlns:w16se="http://schemas.microsoft.com/office/word/2015/wordml/symex" xmlns:wpg="http://schemas.microsoft.com/office/word/2010/wordprocessingGroup" xmlns:wpi="http://schemas.microsoft.com/office/word/2010/wordprocessingInk" xmlns:wne="http://schemas.microsoft.com/office/word/2006/wordml" xmlns:wps="http://schemas.microsoft.com/office/word/2010/wordprocessingShape" mc:Ignorable="w14 w15 w16se w16cid w16 w16cex w16sdtdh w16sdtfl w16du wp14">
+<w:hdr xmlns:wpc="http://schemas.microsoft.com/office/word/2010/wordprocessingCanvas" xmlns:cx="http://schemas.microsoft.com/office/drawing/2014/chartex" xmlns:cx1="http://schemas.microsoft.com/office/drawing/2015/9/8/chartex" xmlns:cx2="http://schemas.microsoft.com/office/drawing/2015/10/21/chartex" xmlns:cx3="http://schemas.microsoft.com/office/drawing/2016/5/9/chartex" xmlns:cx4="http://schemas.microsoft.com/office/drawing/2016/5/10/chartex" xmlns:cx5="http://schemas.microsoft.com/office/drawing/2016/5/11/chartex" xmlns:cx6="http://schemas.microsoft.com/office/drawing/2016/5/12/chartex" xmlns:cx7="http://schemas.microsoft.com/office/drawing/2016/5/13/chartex" xmlns:cx8="http://schemas.microsoft.com/office/drawing/2016/5/14/chartex" xmlns:mc="http://schemas.openxmlformats.org/markup-compatibility/2006" xmlns:m="http://schemas.openxmlformats.org/officeDocument/2006/math" xmlns:aink="http://schemas.microsoft.com/office/drawing/2016/ink" xmlns:am3d="http://schemas.microsoft.com/office/drawing/2017/model3d" xmlns:oel="http://schemas.microsoft.com/office/2019/extlst" xmlns:r="http://schemas.openxmlformats.org/officeDocument/2006/relationships" xmlns:wp14="http://schemas.microsoft.com/office/word/2010/wordprocessingDrawing" xmlns:wp="http://schemas.openxmlformats.org/drawingml/2006/wordprocessingDrawing" xmlns:wpg="http://schemas.microsoft.com/office/word/2010/wordprocessingGroup" xmlns:wpi="http://schemas.microsoft.com/office/word/2010/wordprocessingInk" xmlns:wps="http://schemas.microsoft.com/office/word/2010/wordprocessingShape" xmlns:o="urn:schemas-microsoft-com:office:office" xmlns:v="urn:schemas-microsoft-com:vml" xmlns:w10="urn:schemas-microsoft-com:office:word" xmlns:w="http://schemas.openxmlformats.org/wordprocessingml/2006/main" xmlns:w14="http://schemas.microsoft.com/office/word/2010/wordml" xmlns:w15="http://schemas.microsoft.com/office/word/2012/wordml" xmlns:w16cex="http://schemas.microsoft.com/office/word/2018/wordml/cex" xmlns:w16cid="http://schemas.microsoft.com/office/word/2016/wordml/cid" xmlns:w16="http://schemas.microsoft.com/office/word/2018/wordml" xmlns:w16sdtdh="http://schemas.microsoft.com/office/word/2020/wordml/sdtdatahash" xmlns:w16sdtfl="http://schemas.microsoft.com/office/word/2024/wordml/sdtformatlock" xmlns:w16se="http://schemas.microsoft.com/office/word/2015/wordml/symex" xmlns:w16du="http://schemas.microsoft.com/office/word/2023/wordml/word16du" xmlns:wne="http://schemas.microsoft.com/office/word/2006/wordml" mc:Ignorable="w14 w15 w16se w16cid w16 w16cex w16sdtdh w16sdtfl w16du wp14">
   <w:p>
     <w:pPr>
       <w:pStyle w:val="Header"/>
@@ -2620,7 +2652,7 @@
 </file>
 
 <file path=word/numbering.xml><?xml version="1.0" encoding="utf-8"?>
-<w:numbering xmlns:wpc="http://schemas.microsoft.com/office/word/2010/wordprocessingCanvas" xmlns:cx="http://schemas.microsoft.com/office/drawing/2014/chartex" xmlns:cx1="http://schemas.microsoft.com/office/drawing/2015/9/8/chartex" xmlns:cx2="http://schemas.microsoft.com/office/drawing/2015/10/21/chartex" xmlns:cx3="http://schemas.microsoft.com/office/drawing/2016/5/9/chartex" xmlns:cx4="http://schemas.microsoft.com/office/drawing/2016/5/10/chartex" xmlns:cx5="http://schemas.microsoft.com/office/drawing/2016/5/11/chartex" xmlns:cx6="http://schemas.microsoft.com/office/drawing/2016/5/12/chartex" xmlns:cx7="http://schemas.microsoft.com/office/drawing/2016/5/13/chartex" xmlns:cx8="http://schemas.microsoft.com/office/drawing/2016/5/14/chartex" xmlns:mc="http://schemas.openxmlformats.org/markup-compatibility/2006" xmlns:aink="http://schemas.microsoft.com/office/drawing/2016/ink" xmlns:am3d="http://schemas.microsoft.com/office/drawing/2017/model3d" xmlns:o="urn:schemas-microsoft-com:office:office" xmlns:oel="http://schemas.microsoft.com/office/2019/extlst" xmlns:r="http://schemas.openxmlformats.org/officeDocument/2006/relationships" xmlns:m="http://schemas.openxmlformats.org/officeDocument/2006/math" xmlns:v="urn:schemas-microsoft-com:vml" xmlns:wp14="http://schemas.microsoft.com/office/word/2010/wordprocessingDrawing" xmlns:wp="http://schemas.openxmlformats.org/drawingml/2006/wordprocessingDrawing" xmlns:w10="urn:schemas-microsoft-com:office:word" xmlns:w="http://schemas.openxmlformats.org/wordprocessingml/2006/main" xmlns:w14="http://schemas.microsoft.com/office/word/2010/wordml" xmlns:w15="http://schemas.microsoft.com/office/word/2012/wordml" xmlns:w16cex="http://schemas.microsoft.com/office/word/2018/wordml/cex" xmlns:w16cid="http://schemas.microsoft.com/office/word/2016/wordml/cid" xmlns:w16="http://schemas.microsoft.com/office/word/2018/wordml" xmlns:w16du="http://schemas.microsoft.com/office/word/2023/wordml/word16du" xmlns:w16sdtdh="http://schemas.microsoft.com/office/word/2020/wordml/sdtdatahash" xmlns:w16sdtfl="http://schemas.microsoft.com/office/word/2024/wordml/sdtformatlock" xmlns:w16se="http://schemas.microsoft.com/office/word/2015/wordml/symex" xmlns:wpg="http://schemas.microsoft.com/office/word/2010/wordprocessingGroup" xmlns:wpi="http://schemas.microsoft.com/office/word/2010/wordprocessingInk" xmlns:wne="http://schemas.microsoft.com/office/word/2006/wordml" xmlns:wps="http://schemas.microsoft.com/office/word/2010/wordprocessingShape" mc:Ignorable="w14 w15 w16se w16cid w16 w16cex w16sdtdh w16sdtfl w16du wp14">
+<w:numbering xmlns:wpc="http://schemas.microsoft.com/office/word/2010/wordprocessingCanvas" xmlns:cx="http://schemas.microsoft.com/office/drawing/2014/chartex" xmlns:cx1="http://schemas.microsoft.com/office/drawing/2015/9/8/chartex" xmlns:cx2="http://schemas.microsoft.com/office/drawing/2015/10/21/chartex" xmlns:cx3="http://schemas.microsoft.com/office/drawing/2016/5/9/chartex" xmlns:cx4="http://schemas.microsoft.com/office/drawing/2016/5/10/chartex" xmlns:cx5="http://schemas.microsoft.com/office/drawing/2016/5/11/chartex" xmlns:cx6="http://schemas.microsoft.com/office/drawing/2016/5/12/chartex" xmlns:cx7="http://schemas.microsoft.com/office/drawing/2016/5/13/chartex" xmlns:cx8="http://schemas.microsoft.com/office/drawing/2016/5/14/chartex" xmlns:mc="http://schemas.openxmlformats.org/markup-compatibility/2006" xmlns:m="http://schemas.openxmlformats.org/officeDocument/2006/math" xmlns:aink="http://schemas.microsoft.com/office/drawing/2016/ink" xmlns:am3d="http://schemas.microsoft.com/office/drawing/2017/model3d" xmlns:oel="http://schemas.microsoft.com/office/2019/extlst" xmlns:r="http://schemas.openxmlformats.org/officeDocument/2006/relationships" xmlns:wp14="http://schemas.microsoft.com/office/word/2010/wordprocessingDrawing" xmlns:wp="http://schemas.openxmlformats.org/drawingml/2006/wordprocessingDrawing" xmlns:wpg="http://schemas.microsoft.com/office/word/2010/wordprocessingGroup" xmlns:wpi="http://schemas.microsoft.com/office/word/2010/wordprocessingInk" xmlns:wps="http://schemas.microsoft.com/office/word/2010/wordprocessingShape" xmlns:o="urn:schemas-microsoft-com:office:office" xmlns:v="urn:schemas-microsoft-com:vml" xmlns:w10="urn:schemas-microsoft-com:office:word" xmlns:w="http://schemas.openxmlformats.org/wordprocessingml/2006/main" xmlns:w14="http://schemas.microsoft.com/office/word/2010/wordml" xmlns:w15="http://schemas.microsoft.com/office/word/2012/wordml" xmlns:w16cex="http://schemas.microsoft.com/office/word/2018/wordml/cex" xmlns:w16cid="http://schemas.microsoft.com/office/word/2016/wordml/cid" xmlns:w16="http://schemas.microsoft.com/office/word/2018/wordml" xmlns:w16sdtdh="http://schemas.microsoft.com/office/word/2020/wordml/sdtdatahash" xmlns:w16sdtfl="http://schemas.microsoft.com/office/word/2024/wordml/sdtformatlock" xmlns:w16se="http://schemas.microsoft.com/office/word/2015/wordml/symex" xmlns:w16du="http://schemas.microsoft.com/office/word/2023/wordml/word16du" xmlns:wne="http://schemas.microsoft.com/office/word/2006/wordml" mc:Ignorable="w14 w15 w16se w16cid w16 w16cex w16sdtdh w16sdtfl w16du wp14">
   <w:abstractNum w:abstractNumId="0" w15:restartNumberingAfterBreak="0">
     <w:nsid w:val="247E287A"/>
     <w:multiLevelType w:val="multilevel"/>
@@ -2931,7 +2963,7 @@
 </file>
 
 <file path=word/styles.xml><?xml version="1.0" encoding="utf-8"?>
-<w:styles xmlns:mc="http://schemas.openxmlformats.org/markup-compatibility/2006" xmlns:r="http://schemas.openxmlformats.org/officeDocument/2006/relationships" xmlns:w="http://schemas.openxmlformats.org/wordprocessingml/2006/main" xmlns:w14="http://schemas.microsoft.com/office/word/2010/wordml" xmlns:w15="http://schemas.microsoft.com/office/word/2012/wordml" xmlns:w16cex="http://schemas.microsoft.com/office/word/2018/wordml/cex" xmlns:w16cid="http://schemas.microsoft.com/office/word/2016/wordml/cid" xmlns:w16="http://schemas.microsoft.com/office/word/2018/wordml" xmlns:w16du="http://schemas.microsoft.com/office/word/2023/wordml/word16du" xmlns:w16sdtdh="http://schemas.microsoft.com/office/word/2020/wordml/sdtdatahash" xmlns:w16sdtfl="http://schemas.microsoft.com/office/word/2024/wordml/sdtformatlock" xmlns:w16se="http://schemas.microsoft.com/office/word/2015/wordml/symex" mc:Ignorable="w14 w15 w16se w16cid w16 w16cex w16sdtdh w16sdtfl w16du">
+<w:styles xmlns:mc="http://schemas.openxmlformats.org/markup-compatibility/2006" xmlns:r="http://schemas.openxmlformats.org/officeDocument/2006/relationships" xmlns:w="http://schemas.openxmlformats.org/wordprocessingml/2006/main" xmlns:w14="http://schemas.microsoft.com/office/word/2010/wordml" xmlns:w15="http://schemas.microsoft.com/office/word/2012/wordml" xmlns:w16cex="http://schemas.microsoft.com/office/word/2018/wordml/cex" xmlns:w16cid="http://schemas.microsoft.com/office/word/2016/wordml/cid" xmlns:w16="http://schemas.microsoft.com/office/word/2018/wordml" xmlns:w16sdtdh="http://schemas.microsoft.com/office/word/2020/wordml/sdtdatahash" xmlns:w16sdtfl="http://schemas.microsoft.com/office/word/2024/wordml/sdtformatlock" xmlns:w16se="http://schemas.microsoft.com/office/word/2015/wordml/symex" xmlns:w16du="http://schemas.microsoft.com/office/word/2023/wordml/word16du" mc:Ignorable="w14 w15 w16se w16cid w16 w16cex w16sdtdh w16sdtfl w16du">
   <w:docDefaults>
     <w:rPrDefault>
       <w:rPr>

</xml_diff>

<commit_message>
Add AI-use policy section and update tareas/controles weighting
New section V "Política de Uso de Inteligencia Artificial" sets rules
per assessment type: AI n/a on written exams/final (in-person, no
devices), allowed with disclosure on tareas and trabajo grupal, banned
on controles. Evaluación item i now reflects the 5%/10% tareas/controles
split within the existing 15%.

Co-Authored-By: Claude Sonnet 5 <noreply@anthropic.com>
</commit_message>
<xml_diff>
--- a/Syllabus_Analisis_Econometrico_2026.docx
+++ b/Syllabus_Analisis_Econometrico_2026.docx
@@ -1849,6 +1849,267 @@
           <w:spacing w:val="54"/>
           <w:lang w:val="es-MX" w:eastAsia="es-ES"/>
         </w:rPr>
+        <w:t>Política de Uso de Inteligencia Artificial</w:t>
+      </w:r>
+    </w:p>
+    <w:p>
+      <w:pPr>
+        <w:spacing w:after="0" w:line="240" w:lineRule="auto"/>
+        <w:jc w:val="both"/>
+        <w:rPr>
+          <w:b/>
+          <w:bCs/>
+          <w:sz w:val="24"/>
+          <w:szCs w:val="24"/>
+        </w:rPr>
+      </w:pPr>
+    </w:p>
+    <w:p>
+      <w:pPr>
+        <w:spacing w:after="0" w:line="240" w:lineRule="auto"/>
+        <w:jc w:val="both"/>
+        <w:rPr>
+          <w:rFonts w:cstheme="minorHAnsi"/>
+          <w:b/>
+          <w:bCs/>
+          <w:sz w:val="24"/>
+          <w:szCs w:val="24"/>
+        </w:rPr>
+      </w:pPr>
+      <w:r>
+        <w:rPr>
+          <w:sz w:val="24"/>
+        </w:rPr>
+        <w:t>El uso de herramientas de inteligencia artificial (IA) generativa está permitido en el curso, con reglas que varían según el tipo de evaluación:</w:t>
+      </w:r>
+    </w:p>
+    <w:p>
+      <w:pPr>
+        <w:spacing w:after="0" w:line="240" w:lineRule="auto"/>
+        <w:jc w:val="both"/>
+        <w:rPr>
+          <w:b/>
+          <w:bCs/>
+          <w:sz w:val="24"/>
+          <w:szCs w:val="24"/>
+        </w:rPr>
+      </w:pPr>
+    </w:p>
+    <w:p>
+      <w:pPr>
+        <w:spacing w:after="0" w:line="240" w:lineRule="auto"/>
+        <w:jc w:val="both"/>
+        <w:rPr>
+          <w:rFonts w:cstheme="minorHAnsi"/>
+          <w:sz w:val="24"/>
+          <w:szCs w:val="24"/>
+          <w:lang w:val="es-ES"/>
+        </w:rPr>
+      </w:pPr>
+      <w:r>
+        <w:rPr>
+          <w:sz w:val="24"/>
+        </w:rPr>
+        <w:t>-</w:t>
+      </w:r>
+      <w:r>
+        <w:rPr>
+          <w:sz w:val="24"/>
+        </w:rPr>
+        <w:tab/>
+      </w:r>
+      <w:r>
+        <w:rPr>
+          <w:b/>
+          <w:sz w:val="24"/>
+        </w:rPr>
+        <w:t>Evaluaciones escritas y Examen Final.</w:t>
+      </w:r>
+      <w:r>
+        <w:rPr>
+          <w:sz w:val="24"/>
+        </w:rPr>
+        <w:t xml:space="preserve"> Son evaluaciones presenciales y sin uso de dispositivos electrónicos; el uso de IA no aplica.</w:t>
+      </w:r>
+    </w:p>
+    <w:p>
+      <w:pPr>
+        <w:spacing w:after="0" w:line="240" w:lineRule="auto"/>
+        <w:jc w:val="both"/>
+        <w:rPr>
+          <w:rFonts w:cstheme="minorHAnsi"/>
+          <w:sz w:val="24"/>
+          <w:szCs w:val="24"/>
+          <w:lang w:val="es-ES"/>
+        </w:rPr>
+      </w:pPr>
+      <w:r>
+        <w:rPr>
+          <w:sz w:val="24"/>
+        </w:rPr>
+        <w:t>-</w:t>
+      </w:r>
+      <w:r>
+        <w:rPr>
+          <w:sz w:val="24"/>
+        </w:rPr>
+        <w:tab/>
+      </w:r>
+      <w:r>
+        <w:rPr>
+          <w:b/>
+          <w:sz w:val="24"/>
+        </w:rPr>
+        <w:t>Tareas.</w:t>
+      </w:r>
+      <w:r>
+        <w:rPr>
+          <w:sz w:val="24"/>
+        </w:rPr>
+        <w:t xml:space="preserve"> El uso de IA está permitido para apoyar la implementación en R. Cada tarea debe incluir una breve declaración de uso: qué herramienta se utilizó, para qué, y qué tuvo que corregirse o verificarse manualmente.</w:t>
+      </w:r>
+    </w:p>
+    <w:p>
+      <w:pPr>
+        <w:spacing w:after="0" w:line="240" w:lineRule="auto"/>
+        <w:jc w:val="both"/>
+        <w:rPr>
+          <w:rFonts w:cstheme="minorHAnsi"/>
+          <w:sz w:val="24"/>
+          <w:szCs w:val="24"/>
+          <w:lang w:val="es-ES"/>
+        </w:rPr>
+      </w:pPr>
+      <w:r>
+        <w:rPr>
+          <w:sz w:val="24"/>
+        </w:rPr>
+        <w:t>-</w:t>
+      </w:r>
+      <w:r>
+        <w:rPr>
+          <w:sz w:val="24"/>
+        </w:rPr>
+        <w:tab/>
+      </w:r>
+      <w:r>
+        <w:rPr>
+          <w:b/>
+          <w:sz w:val="24"/>
+        </w:rPr>
+        <w:t>Controles.</w:t>
+      </w:r>
+      <w:r>
+        <w:rPr>
+          <w:sz w:val="24"/>
+        </w:rPr>
+        <w:t xml:space="preserve"> Son evaluaciones breves (aproximadamente 15 minutos), individuales, sin uso de IA ni apuntes, consistentes en una de las preguntas teóricas de la tarea de esa semana; la pregunta específica no se informa con anticipación.</w:t>
+      </w:r>
+    </w:p>
+    <w:p>
+      <w:pPr>
+        <w:spacing w:after="0" w:line="240" w:lineRule="auto"/>
+        <w:jc w:val="both"/>
+        <w:rPr>
+          <w:rFonts w:cstheme="minorHAnsi"/>
+          <w:sz w:val="24"/>
+          <w:szCs w:val="24"/>
+          <w:lang w:val="es-ES"/>
+        </w:rPr>
+      </w:pPr>
+      <w:r>
+        <w:rPr>
+          <w:sz w:val="24"/>
+        </w:rPr>
+        <w:t>-</w:t>
+      </w:r>
+      <w:r>
+        <w:rPr>
+          <w:sz w:val="24"/>
+        </w:rPr>
+        <w:tab/>
+      </w:r>
+      <w:r>
+        <w:rPr>
+          <w:b/>
+          <w:sz w:val="24"/>
+        </w:rPr>
+        <w:t>Trabajo Grupal.</w:t>
+      </w:r>
+      <w:r>
+        <w:rPr>
+          <w:sz w:val="24"/>
+        </w:rPr>
+        <w:t xml:space="preserve"> El uso de IA está permitido y se fomenta para la revisión de literatura, el desarrollo de código y la redacción del informe. El informe final debe incluir una breve declaración de uso de IA.</w:t>
+      </w:r>
+    </w:p>
+    <w:p>
+      <w:pPr>
+        <w:spacing w:after="0" w:line="240" w:lineRule="auto"/>
+        <w:jc w:val="both"/>
+        <w:rPr>
+          <w:b/>
+          <w:bCs/>
+          <w:sz w:val="24"/>
+          <w:szCs w:val="24"/>
+        </w:rPr>
+      </w:pPr>
+    </w:p>
+    <w:p>
+      <w:pPr>
+        <w:spacing w:after="0" w:line="240" w:lineRule="auto"/>
+        <w:jc w:val="both"/>
+        <w:rPr>
+          <w:rFonts w:cstheme="minorHAnsi"/>
+          <w:b/>
+          <w:bCs/>
+          <w:sz w:val="24"/>
+          <w:szCs w:val="24"/>
+        </w:rPr>
+      </w:pPr>
+      <w:r>
+        <w:rPr>
+          <w:sz w:val="24"/>
+        </w:rPr>
+        <w:t>El objetivo de esta política es que la IA se integre como una herramienta de trabajo -tal como ocurre en la práctica de la investigación aplicada- sin sustituir la comprensión de los fundamentos del curso, la que se verifica mediante los controles y las evaluaciones presenciales.</w:t>
+      </w:r>
+    </w:p>
+    <w:p>
+      <w:pPr>
+        <w:spacing w:after="0" w:line="240" w:lineRule="auto"/>
+        <w:jc w:val="both"/>
+        <w:rPr>
+          <w:b/>
+          <w:bCs/>
+          <w:sz w:val="24"/>
+          <w:szCs w:val="24"/>
+        </w:rPr>
+      </w:pPr>
+    </w:p>
+    <w:p>
+      <w:pPr>
+        <w:numPr>
+          <w:ilvl w:val="0"/>
+          <w:numId w:val="1"/>
+        </w:numPr>
+        <w:shd w:val="clear" w:color="auto" w:fill="D9D9D9"/>
+        <w:spacing w:after="0" w:line="240" w:lineRule="auto"/>
+        <w:ind w:left="0" w:firstLine="0"/>
+        <w:jc w:val="both"/>
+        <w:rPr>
+          <w:rFonts w:ascii="Calibri" w:eastAsia="Times New Roman" w:hAnsi="Calibri" w:cs="Calibri"/>
+          <w:smallCaps/>
+          <w:spacing w:val="54"/>
+          <w:lang w:val="es-MX" w:eastAsia="es-ES"/>
+        </w:rPr>
+      </w:pPr>
+      <w:r>
+        <w:rPr>
+          <w:rFonts w:eastAsia="Times New Roman" w:cs="Calibri"/>
+          <w:smallCaps/>
+          <w:spacing w:val="54"/>
+          <w:lang w:val="es-MX" w:eastAsia="es-ES"/>
+        </w:rPr>
         <w:t>Evaluación de aprendizajes</w:t>
       </w:r>
     </w:p>
@@ -1932,7 +2193,7 @@
           <w:szCs w:val="24"/>
           <w:lang w:val="es-ES"/>
         </w:rPr>
-        <w:t xml:space="preserve"> Las tareas prácticas se enfocan en la implementación empírica de los principales diseños de inferencia causal mediante el uso del software estadístico R. A su vez, permiten reforzar los fundamentos teóricos y metodológicos abordados en clase. Los controles a su vez permitirán retroalimentar a los y las estudiantes para orientar hacia el logro de los objetivos.</w:t>
+        <w:t xml:space="preserve"> Las tareas (5%) se enfocan en la implementación empírica de los principales diseños de inferencia causal mediante el uso del software estadístico R; el uso de inteligencia artificial está permitido en su desarrollo (ver Política de Uso de Inteligencia Artificial). Los controles (10%) son evaluaciones breves e individuales, sin apoyo de IA ni apuntes, que verifican la comprensión de los contenidos trabajados en la tarea correspondiente.</w:t>
       </w:r>
     </w:p>
     <w:p>

</xml_diff>

<commit_message>
Add clean slides for all 7 topics; refresh 1.intro for 2026
1.intro is fully refreshed: renamed to Análisis Econométrico, 2026
housekeeping (Ramiro de Elejalde, Alexis Silva, 5%/10% tareas/controles
weighting), \term{} styling to reserve \alert{} for genuine callouts,
updated closing examples (real 2025 group projects, no student names),
and the CASEN retornos-a-la-educación example rebuilt in R (CASEN 2024,
LaTeX-native tables, corrected Mincer specification with explicit
female/rural dummies and región fixed effects, coefficient-stability
table and plot).

Topics 2-7 and extra/Bootstrap are added as clean tex+figures (no
generation code, no speech-note docs, no build artifacts), unreviewed
pending the same deck-by-deck pass 1.intro just got.

Also includes a small syllabus title fix and README wording update.

Co-Authored-By: Claude Sonnet 5 <noreply@anthropic.com>
</commit_message>
<xml_diff>
--- a/Syllabus_Analisis_Econometrico_2026.docx
+++ b/Syllabus_Analisis_Econometrico_2026.docx
@@ -8,17 +8,19 @@
         <w:jc w:val="center"/>
         <w:rPr>
           <w:b/>
-          <w:sz w:val="24"/>
-          <w:szCs w:val="24"/>
-        </w:rPr>
-      </w:pPr>
-      <w:r>
-        <w:rPr>
-          <w:b/>
-          <w:sz w:val="24"/>
-          <w:szCs w:val="24"/>
-        </w:rPr>
-        <w:t>Programa de Postgrado en Economía</w:t>
+          <w:bCs/>
+          <w:sz w:val="24"/>
+          <w:szCs w:val="24"/>
+        </w:rPr>
+      </w:pPr>
+      <w:r>
+        <w:rPr>
+          <w:b/>
+          <w:bCs/>
+          <w:sz w:val="24"/>
+          <w:szCs w:val="24"/>
+        </w:rPr>
+        <w:t>Magíster en Economía</w:t>
       </w:r>
     </w:p>
     <w:p>
@@ -2143,6 +2145,7 @@
           <w:szCs w:val="24"/>
           <w:lang w:val="es-ES"/>
         </w:rPr>
+        <w:lastRenderedPageBreak/>
         <w:t>La evaluación de Análisis Econométrico está diseñada para reflejar de manera coherente los objetivos generales y específicos del curso, combinando instancias teóricas, prácticas y de comunicación académica, tanto oral como escrita. Los componentes y su ponderación son los siguientes:</w:t>
       </w:r>
     </w:p>
@@ -2469,7 +2472,6 @@
           <w:sz w:val="24"/>
           <w:szCs w:val="24"/>
         </w:rPr>
-        <w:lastRenderedPageBreak/>
         <w:t>Al finalizar Análisis Econométrico, los estudiantes deberán ser capaces de comprender y aplicar los fundamentos teóricos y prácticos de la econometría, con énfasis en la estimación e inferencia en modelos de regresión lineal. El curso busca que los estudiantes desarrollen un pensamiento econométrico riguroso, comprendan los supuestos que sustentan los métodos de estimación y sean capaces de identificar sus limitaciones en contextos empíricos concretos.</w:t>
       </w:r>
     </w:p>
@@ -2769,6 +2771,7 @@
           <w:sz w:val="24"/>
           <w:lang w:val="en-US"/>
         </w:rPr>
+        <w:lastRenderedPageBreak/>
         <w:t xml:space="preserve">Angrist, J. D. (1990). Lifetime earnings and the Vietnam era draft lottery: evidence from social security administrative records. </w:t>
       </w:r>
       <w:r>
@@ -3663,7 +3666,6 @@
   <w:style w:type="character" w:default="1" w:styleId="DefaultParagraphFont">
     <w:name w:val="Default Paragraph Font"/>
     <w:uiPriority w:val="1"/>
-    <w:semiHidden/>
     <w:unhideWhenUsed/>
   </w:style>
   <w:style w:type="table" w:default="1" w:styleId="TableNormal">

</xml_diff>